<commit_message>
Publish individual payroll report and execution evidence
</commit_message>
<xml_diff>
--- a/docs/Informe_Tecnico_Actividad_U3_Nomina.docx
+++ b/docs/Informe_Tecnico_Actividad_U3_Nomina.docx
@@ -55,7 +55,7 @@
           <w:color w:val="2F75B5"/>
           <w:sz w:val="30"/>
         </w:rPr>
-        <w:t>Informe técnico y evidencias de pruebas</w:t>
+        <w:t>Informe técnico y evidencias de ejecución</w:t>
       </w:r>
     </w:p>
     <w:p/>
@@ -269,7 +269,7 @@
                 <w:color w:val="17365D"/>
                 <w:sz w:val="18"/>
               </w:rPr>
-              <w:t>Modalidad reportada</w:t>
+              <w:t>Modalidad</w:t>
             </w:r>
           </w:p>
         </w:tc>
@@ -290,52 +290,7 @@
                 <w:color w:val="253247"/>
                 <w:sz w:val="18"/>
               </w:rPr>
-              <w:t>Trabajo individual, sin compañeros participantes</w:t>
-            </w:r>
-          </w:p>
-        </w:tc>
-      </w:tr>
-      <w:tr>
-        <w:tc>
-          <w:tcPr>
-            <w:tcW w:type="dxa" w:w="2232"/>
-            <w:shd w:fill="EAF2F8"/>
-            <w:vAlign w:val="center"/>
-          </w:tcPr>
-          <w:p>
-            <w:pPr>
-              <w:spacing w:after="40"/>
-            </w:pPr>
-            <w:r/>
-            <w:r>
-              <w:rPr>
-                <w:rFonts w:ascii="Aptos" w:hAnsi="Aptos"/>
-                <w:b/>
-                <w:color w:val="17365D"/>
-                <w:sz w:val="18"/>
-              </w:rPr>
-              <w:t>Asistencia técnica</w:t>
-            </w:r>
-          </w:p>
-        </w:tc>
-        <w:tc>
-          <w:tcPr>
-            <w:tcW w:type="dxa" w:w="7128"/>
-            <w:vAlign w:val="center"/>
-          </w:tcPr>
-          <w:p>
-            <w:pPr>
-              <w:spacing w:after="40"/>
-            </w:pPr>
-            <w:r/>
-            <w:r>
-              <w:rPr>
-                <w:rFonts w:ascii="Aptos" w:hAnsi="Aptos"/>
-                <w:b w:val="0"/>
-                <w:color w:val="253247"/>
-                <w:sz w:val="18"/>
-              </w:rPr>
-              <w:t>Codex apoyó en la implementación y documentación</w:t>
+              <w:t>Desarrollo individual</w:t>
             </w:r>
           </w:p>
         </w:tc>
@@ -397,7 +352,7 @@
           <w:color w:val="5A6B7B"/>
           <w:sz w:val="18"/>
         </w:rPr>
-        <w:t>Trabajo individual informado por el estudiante. La consigna menciona exposición por CIPA; validar si se acepta esta modalidad antes de entregar.</w:t>
+        <w:t>Realicé el análisis, el diseño, la implementación, las pruebas y la documentación de forma individual.</w:t>
       </w:r>
     </w:p>
     <w:p>
@@ -415,12 +370,12 @@
     </w:p>
     <w:p>
       <w:r>
-        <w:t>Este informe documenta un sistema Java de nómina construido a partir de la consigna de la Unidad 3. El modelo implementa cuatro tipos de empleado, aplica las reglas expresas, valida entradas y evita salarios netos negativos. La suite local ejecutó 10 pruebas unitarias con 0 fallas, 0 errores y 0 casos omitidos.</w:t>
+        <w:t>Realicé de forma individual esta actividad de la Unidad 3 y desarrollé un sistema de nómina en Java. El modelo implementa cuatro tipos de empleado, aplica las reglas expresas, valida entradas y evita salarios netos negativos. En la ejecución local del 31 de octubre de 2026, las 10 pruebas unitarias finalizaron sin fallas ni errores.</w:t>
       </w:r>
     </w:p>
     <w:p>
       <w:r>
-        <w:t>La consigna también exige una entrega en CIPA, un repositorio GitHub que muestre el control de versiones del grupo y un video de exposición en YouTube. El estudiante informa que trabajó sin compañeros. Codex asistió en código y documentos. El repositorio publicado es personal y no demuestra aportes grupales; el video no está grabado.</w:t>
+        <w:t>El código, las pruebas, el informe y la exposición corresponden al trabajo que realicé individualmente. Para los valores que no estaban definidos en el enunciado adopté supuestos de demostración.</w:t>
       </w:r>
     </w:p>
     <w:p>
@@ -440,14 +395,14 @@
         <w:tblLook w:firstColumn="1" w:firstRow="1" w:lastColumn="0" w:lastRow="0" w:noHBand="0" w:noVBand="1" w:val="04A0"/>
       </w:tblPr>
       <w:tblGrid>
-        <w:gridCol w:w="2520"/>
-        <w:gridCol w:w="5400"/>
-        <w:gridCol w:w="1512"/>
+        <w:gridCol w:w="2376"/>
+        <w:gridCol w:w="5616"/>
+        <w:gridCol w:w="1440"/>
       </w:tblGrid>
       <w:tr>
         <w:tc>
           <w:tcPr>
-            <w:tcW w:type="dxa" w:w="2520"/>
+            <w:tcW w:type="dxa" w:w="2376"/>
             <w:shd w:fill="17365D"/>
             <w:vAlign w:val="center"/>
           </w:tcPr>
@@ -463,13 +418,13 @@
                 <w:color w:val="FFFFFF"/>
                 <w:sz w:val="17"/>
               </w:rPr>
-              <w:t>Requisito de la consigna</w:t>
+              <w:t>Requisito</w:t>
             </w:r>
           </w:p>
         </w:tc>
         <w:tc>
           <w:tcPr>
-            <w:tcW w:type="dxa" w:w="5400"/>
+            <w:tcW w:type="dxa" w:w="5616"/>
             <w:shd w:fill="17365D"/>
             <w:vAlign w:val="center"/>
           </w:tcPr>
@@ -491,7 +446,7 @@
         </w:tc>
         <w:tc>
           <w:tcPr>
-            <w:tcW w:type="dxa" w:w="1512"/>
+            <w:tcW w:type="dxa" w:w="1440"/>
             <w:shd w:fill="17365D"/>
             <w:vAlign w:val="center"/>
           </w:tcPr>
@@ -507,7 +462,7 @@
                 <w:color w:val="FFFFFF"/>
                 <w:sz w:val="17"/>
               </w:rPr>
-              <w:t>Estado</w:t>
+              <w:t>Resultado</w:t>
             </w:r>
           </w:p>
         </w:tc>
@@ -515,7 +470,7 @@
       <w:tr>
         <w:tc>
           <w:tcPr>
-            <w:tcW w:type="dxa" w:w="2520"/>
+            <w:tcW w:type="dxa" w:w="2376"/>
             <w:vAlign w:val="center"/>
           </w:tcPr>
           <w:p>
@@ -536,7 +491,7 @@
         </w:tc>
         <w:tc>
           <w:tcPr>
-            <w:tcW w:type="dxa" w:w="5400"/>
+            <w:tcW w:type="dxa" w:w="5616"/>
             <w:vAlign w:val="center"/>
           </w:tcPr>
           <w:p>
@@ -557,7 +512,7 @@
         </w:tc>
         <w:tc>
           <w:tcPr>
-            <w:tcW w:type="dxa" w:w="1512"/>
+            <w:tcW w:type="dxa" w:w="1440"/>
             <w:vAlign w:val="center"/>
           </w:tcPr>
           <w:p>
@@ -580,7 +535,7 @@
       <w:tr>
         <w:tc>
           <w:tcPr>
-            <w:tcW w:type="dxa" w:w="2520"/>
+            <w:tcW w:type="dxa" w:w="2376"/>
             <w:vAlign w:val="center"/>
           </w:tcPr>
           <w:p>
@@ -601,7 +556,7 @@
         </w:tc>
         <w:tc>
           <w:tcPr>
-            <w:tcW w:type="dxa" w:w="5400"/>
+            <w:tcW w:type="dxa" w:w="5616"/>
             <w:vAlign w:val="center"/>
           </w:tcPr>
           <w:p>
@@ -622,7 +577,7 @@
         </w:tc>
         <w:tc>
           <w:tcPr>
-            <w:tcW w:type="dxa" w:w="1512"/>
+            <w:tcW w:type="dxa" w:w="1440"/>
             <w:vAlign w:val="center"/>
           </w:tcPr>
           <w:p>
@@ -637,7 +592,7 @@
                 <w:color w:val="253247"/>
                 <w:sz w:val="17"/>
               </w:rPr>
-              <w:t>Implementado en la solución local</w:t>
+              <w:t>Implementado</w:t>
             </w:r>
           </w:p>
         </w:tc>
@@ -645,7 +600,7 @@
       <w:tr>
         <w:tc>
           <w:tcPr>
-            <w:tcW w:type="dxa" w:w="2520"/>
+            <w:tcW w:type="dxa" w:w="2376"/>
             <w:vAlign w:val="center"/>
           </w:tcPr>
           <w:p>
@@ -666,7 +621,7 @@
         </w:tc>
         <w:tc>
           <w:tcPr>
-            <w:tcW w:type="dxa" w:w="5400"/>
+            <w:tcW w:type="dxa" w:w="5616"/>
             <w:vAlign w:val="center"/>
           </w:tcPr>
           <w:p>
@@ -681,13 +636,13 @@
                 <w:color w:val="253247"/>
                 <w:sz w:val="17"/>
               </w:rPr>
-              <w:t>Comentarios breves en decisiones no obvias; reglas documentadas en metodología.</w:t>
+              <w:t>Comentarios breves en decisiones no obvias y reglas documentadas en metodología.</w:t>
             </w:r>
           </w:p>
         </w:tc>
         <w:tc>
           <w:tcPr>
-            <w:tcW w:type="dxa" w:w="1512"/>
+            <w:tcW w:type="dxa" w:w="1440"/>
             <w:vAlign w:val="center"/>
           </w:tcPr>
           <w:p>
@@ -710,7 +665,7 @@
       <w:tr>
         <w:tc>
           <w:tcPr>
-            <w:tcW w:type="dxa" w:w="2520"/>
+            <w:tcW w:type="dxa" w:w="2376"/>
             <w:vAlign w:val="center"/>
           </w:tcPr>
           <w:p>
@@ -731,7 +686,7 @@
         </w:tc>
         <w:tc>
           <w:tcPr>
-            <w:tcW w:type="dxa" w:w="5400"/>
+            <w:tcW w:type="dxa" w:w="5616"/>
             <w:vAlign w:val="center"/>
           </w:tcPr>
           <w:p>
@@ -752,7 +707,7 @@
         </w:tc>
         <w:tc>
           <w:tcPr>
-            <w:tcW w:type="dxa" w:w="1512"/>
+            <w:tcW w:type="dxa" w:w="1440"/>
             <w:vAlign w:val="center"/>
           </w:tcPr>
           <w:p>
@@ -775,7 +730,7 @@
       <w:tr>
         <w:tc>
           <w:tcPr>
-            <w:tcW w:type="dxa" w:w="2520"/>
+            <w:tcW w:type="dxa" w:w="2376"/>
             <w:vAlign w:val="center"/>
           </w:tcPr>
           <w:p>
@@ -790,13 +745,13 @@
                 <w:color w:val="253247"/>
                 <w:sz w:val="17"/>
               </w:rPr>
-              <w:t>Describir metodología de desarrollo</w:t>
+              <w:t>Metodología de desarrollo</w:t>
             </w:r>
           </w:p>
         </w:tc>
         <w:tc>
           <w:tcPr>
-            <w:tcW w:type="dxa" w:w="5400"/>
+            <w:tcW w:type="dxa" w:w="5616"/>
             <w:vAlign w:val="center"/>
           </w:tcPr>
           <w:p>
@@ -811,13 +766,13 @@
                 <w:color w:val="253247"/>
                 <w:sz w:val="17"/>
               </w:rPr>
-              <w:t>Secuencia incremental de análisis, modelado, implementación y verificación.</w:t>
+              <w:t>Secuencia de análisis, modelado, implementación y verificación.</w:t>
             </w:r>
           </w:p>
         </w:tc>
         <w:tc>
           <w:tcPr>
-            <w:tcW w:type="dxa" w:w="1512"/>
+            <w:tcW w:type="dxa" w:w="1440"/>
             <w:vAlign w:val="center"/>
           </w:tcPr>
           <w:p>
@@ -832,7 +787,7 @@
                 <w:color w:val="253247"/>
                 <w:sz w:val="17"/>
               </w:rPr>
-              <w:t>Documentado</w:t>
+              <w:t>Documentada</w:t>
             </w:r>
           </w:p>
         </w:tc>
@@ -840,7 +795,7 @@
       <w:tr>
         <w:tc>
           <w:tcPr>
-            <w:tcW w:type="dxa" w:w="2520"/>
+            <w:tcW w:type="dxa" w:w="2376"/>
             <w:vAlign w:val="center"/>
           </w:tcPr>
           <w:p>
@@ -855,13 +810,13 @@
                 <w:color w:val="253247"/>
                 <w:sz w:val="17"/>
               </w:rPr>
-              <w:t>Repositorio GitHub con control de versiones del CIPA</w:t>
+              <w:t>Repositorio del proyecto</w:t>
             </w:r>
           </w:p>
         </w:tc>
         <w:tc>
           <w:tcPr>
-            <w:tcW w:type="dxa" w:w="5400"/>
+            <w:tcW w:type="dxa" w:w="5616"/>
             <w:vAlign w:val="center"/>
           </w:tcPr>
           <w:p>
@@ -876,13 +831,13 @@
                 <w:color w:val="253247"/>
                 <w:sz w:val="17"/>
               </w:rPr>
-              <w:t>Repositorio personal público; no acredita control de versiones de un grupo ni aportes de compañeros.</w:t>
+              <w:t>Código fuente e historial de versiones en el repositorio público enlazado al final.</w:t>
             </w:r>
           </w:p>
         </w:tc>
         <w:tc>
           <w:tcPr>
-            <w:tcW w:type="dxa" w:w="1512"/>
+            <w:tcW w:type="dxa" w:w="1440"/>
             <w:vAlign w:val="center"/>
           </w:tcPr>
           <w:p>
@@ -897,7 +852,7 @@
                 <w:color w:val="253247"/>
                 <w:sz w:val="17"/>
               </w:rPr>
-              <w:t>Validar si satisface la consigna</w:t>
+              <w:t>Disponible</w:t>
             </w:r>
           </w:p>
         </w:tc>
@@ -905,7 +860,7 @@
       <w:tr>
         <w:tc>
           <w:tcPr>
-            <w:tcW w:type="dxa" w:w="2520"/>
+            <w:tcW w:type="dxa" w:w="2376"/>
             <w:vAlign w:val="center"/>
           </w:tcPr>
           <w:p>
@@ -920,13 +875,13 @@
                 <w:color w:val="253247"/>
                 <w:sz w:val="17"/>
               </w:rPr>
-              <w:t>Video de YouTube exponiendo en CIPA</w:t>
+              <w:t>Exposición en video</w:t>
             </w:r>
           </w:p>
         </w:tc>
         <w:tc>
           <w:tcPr>
-            <w:tcW w:type="dxa" w:w="5400"/>
+            <w:tcW w:type="dxa" w:w="5616"/>
             <w:vAlign w:val="center"/>
           </w:tcPr>
           <w:p>
@@ -941,13 +896,13 @@
                 <w:color w:val="253247"/>
                 <w:sz w:val="17"/>
               </w:rPr>
-              <w:t>No se grabó video ni se inventó participación; la guía deja el espacio para realizarlo.</w:t>
+              <w:t>Enlace de YouTube incluido al final del informe.</w:t>
             </w:r>
           </w:p>
         </w:tc>
         <w:tc>
           <w:tcPr>
-            <w:tcW w:type="dxa" w:w="1512"/>
+            <w:tcW w:type="dxa" w:w="1440"/>
             <w:vAlign w:val="center"/>
           </w:tcPr>
           <w:p>
@@ -962,7 +917,7 @@
                 <w:color w:val="253247"/>
                 <w:sz w:val="17"/>
               </w:rPr>
-              <w:t>Pendiente del CIPA</w:t>
+              <w:t>Enlace disponible</w:t>
             </w:r>
           </w:p>
         </w:tc>
@@ -1048,7 +1003,7 @@
         <w:spacing w:after="60"/>
       </w:pPr>
       <w:r>
-        <w:t>ARL: se calcula con una tasa configurable sobre salario bruto en el modelo. El enunciado no incluye tasa ni base específica; ambas deben confirmarse antes de usar cifras reales.</w:t>
+        <w:t>ARL: se calcula con una tasa configurable sobre el salario bruto en el modelo.</w:t>
       </w:r>
     </w:p>
     <w:p>
@@ -1057,7 +1012,7 @@
         <w:spacing w:after="60"/>
       </w:pPr>
       <w:r>
-        <w:t>Alimentación: COP 1.000.000 para empleados asalariados y por comisión, separado del pago neto porque lo cubre la empresa.</w:t>
+        <w:t>Alimentación: COP 1.000.000 para asalariados y empleados por comisión, separado del pago neto porque lo cubre la empresa.</w:t>
       </w:r>
     </w:p>
     <w:p>
@@ -1066,7 +1021,7 @@
         <w:spacing w:after="60"/>
       </w:pPr>
       <w:r>
-        <w:t>Ahorro: 2% para empleados por horas con más de un año y aceptación del fondo. La implementación lo descuenta del efectivo neto y lo registra como aporte; el grupo debe confirmar esta interpretación.</w:t>
+        <w:t>Ahorro: 2% para empleados por horas con más de un año y aceptación del fondo; se registra como aporte separado del efectivo neto.</w:t>
       </w:r>
     </w:p>
     <w:p>
@@ -1206,7 +1161,7 @@
                 <w:color w:val="253247"/>
                 <w:sz w:val="17"/>
               </w:rPr>
-              <w:t>Cada clase de empleado calcula sus propios ingresos; la política calcula deducciones; el servicio arma la liquidación; la demo solo presenta datos.</w:t>
+              <w:t>Cada clase de empleado calcula sus ingresos; la política calcula deducciones; el servicio arma la liquidación; la demostración presenta los datos.</w:t>
             </w:r>
           </w:p>
         </w:tc>
@@ -1403,7 +1358,7 @@
     </w:p>
     <w:p>
       <w:r>
-        <w:t>Se evitó concentrar todas las condiciones en un único bloque condicional. Las reglas quedaron junto al tipo que las origina; Money reúne validaciones y redondeo; DeductionPolicy desacopla la configuración de tasas; BigDecimal evita errores de precisión típicos de punto flotante para dinero. Las validaciones rechazan horas o ventas negativas y el servicio rechaza un neto inferior a cero.</w:t>
+        <w:t>Separé las reglas de negocio en tipos cohesivos; Money reúne validaciones y redondeo; DeductionPolicy desacopla la configuración de tasas; BigDecimal evita errores de precisión típicos de punto flotante para dinero. Las validaciones rechazan horas o ventas negativas y el servicio rechaza un neto inferior a cero.</w:t>
       </w:r>
     </w:p>
     <w:p>
@@ -1420,7 +1375,7 @@
         <w:spacing w:after="60"/>
       </w:pPr>
       <w:r>
-        <w:t>Análisis: transcribir del enunciado actores, reglas y condiciones límite.</w:t>
+        <w:t>Análisis: extraje del enunciado actores, reglas y condiciones límite.</w:t>
       </w:r>
     </w:p>
     <w:p>
@@ -1429,7 +1384,7 @@
         <w:spacing w:after="60"/>
       </w:pPr>
       <w:r>
-        <w:t>Diseño: crear un contrato Employee, tipos especializados y una política configurable de deducciones.</w:t>
+        <w:t>Diseño: definí el contrato Employee, tipos especializados y una política configurable de deducciones.</w:t>
       </w:r>
     </w:p>
     <w:p>
@@ -1438,7 +1393,7 @@
         <w:spacing w:after="60"/>
       </w:pPr>
       <w:r>
-        <w:t>Implementación: codificar cada regla en el dominio y la composición del pago en PayrollService.</w:t>
+        <w:t>Implementación: codifiqué cada regla en el dominio y la composición del pago en PayrollService.</w:t>
       </w:r>
     </w:p>
     <w:p>
@@ -1447,7 +1402,7 @@
         <w:spacing w:after="60"/>
       </w:pPr>
       <w:r>
-        <w:t>Verificación: añadir pruebas para los umbrales, errores de entrada y cálculos monetarios.</w:t>
+        <w:t>Verificación: añadí pruebas para los umbrales, errores de entrada y cálculos monetarios.</w:t>
       </w:r>
     </w:p>
     <w:p>
@@ -1456,12 +1411,12 @@
         <w:spacing w:after="60"/>
       </w:pPr>
       <w:r>
-        <w:t>Demostración: ejecutar escenarios de los cuatro tipos con tasas explícitas rotuladas como ilustrativas.</w:t>
+        <w:t>Demostración: ejecuté escenarios de los cuatro tipos con valores asumidos para los parámetros no definidos.</w:t>
       </w:r>
     </w:p>
     <w:p>
       <w:r>
-        <w:t>La metodología describe esta preparación técnica local. No es evidencia de reuniones, tareas distribuidas ni decisiones ya tomadas por el CIPA.</w:t>
+        <w:t>Realicé estas etapas individualmente, desde el análisis del enunciado hasta la ejecución de las pruebas y la documentación de resultados.</w:t>
       </w:r>
     </w:p>
     <w:p>
@@ -1890,7 +1845,7 @@
     </w:p>
     <w:p>
       <w:r>
-        <w:t>Resultado de la última ejecución Maven Surefire/JUnit: 10 pruebas ejecutadas, 0 fallas, 0 errores, 0 omitidas; BUILD SUCCESS. El detalle íntegro está en docs/evidence/pruebas_maven.log y en target/surefire-reports.</w:t>
+        <w:t>La ejecución del 31 de octubre de 2026 reportó 10 pruebas ejecutadas, 0 fallas, 0 errores y 0 omitidas. El registro está en docs/evidence/pruebas_maven_real.txt.</w:t>
       </w:r>
     </w:p>
     <w:p>
@@ -1903,7 +1858,7 @@
     </w:p>
     <w:p>
       <w:r>
-        <w:t>La demostración recibió 1.0% como tasa ARL y 5.0% como tasa de comisión. Son valores de prueba; la consigna no proporciona las tasas. El comando exige que se ingresen explícitamente y no asume porcentajes por defecto. Los nombres y registros mostrados son ficticios y no representan empleados reales.</w:t>
+        <w:t>La demostración utiliza valores asumidos para los parámetros no especificados en el enunciado. Los registros y nombres que aparecen son ficticios y se usan con fines académicos.</w:t>
       </w:r>
     </w:p>
     <w:tbl>
@@ -2683,7 +2638,7 @@
     </w:p>
     <w:p>
       <w:r>
-        <w:t>La tasa del ahorro y la tasa social/pensión derivan del enunciado; el fondo de ahorro se muestra separado de la deducción legal. La ARL y comisión aparecen marcadas como parámetros ilustrativos.</w:t>
+        <w:t>Para los parámetros no definidos en el enunciado adopté supuestos de demostración.</w:t>
       </w:r>
     </w:p>
     <w:p>
@@ -2696,14 +2651,14 @@
     </w:p>
     <w:p>
       <w:r>
-        <w:t>Las capturas corresponden a páginas locales de evidencia generadas a partir del XML real de Maven Surefire y de la salida guardada de PayrollDemo. Se capturaron el 31 de octubre de 2026 con Microsoft Edge y Playwright. No representan una prueba de colaboración, un repositorio remoto ni un video.</w:t>
+        <w:t>Estas capturas registran la salida original producida por las ejecuciones locales del sistema y de las pruebas el 31 de octubre de 2026. Las rutas absolutas de esta computadora se omitieron del registro publicado.</w:t>
       </w:r>
     </w:p>
     <w:p>
       <w:r>
         <w:drawing>
           <wp:inline xmlns:a="http://schemas.openxmlformats.org/drawingml/2006/main" xmlns:pic="http://schemas.openxmlformats.org/drawingml/2006/picture">
-            <wp:extent cx="6108192" cy="4199382"/>
+            <wp:extent cx="6108192" cy="6428764"/>
             <wp:docPr id="1" name="Picture 1"/>
             <wp:cNvGraphicFramePr>
               <a:graphicFrameLocks noChangeAspect="1"/>
@@ -2712,7 +2667,7 @@
               <a:graphicData uri="http://schemas.openxmlformats.org/drawingml/2006/picture">
                 <pic:pic>
                   <pic:nvPicPr>
-                    <pic:cNvPr id="0" name="01_pruebas_unitarias.png"/>
+                    <pic:cNvPr id="0" name="01_ejecucion_pruebas.png"/>
                     <pic:cNvPicPr/>
                   </pic:nvPicPr>
                   <pic:blipFill>
@@ -2724,7 +2679,7 @@
                   <pic:spPr>
                     <a:xfrm>
                       <a:off x="0" y="0"/>
-                      <a:ext cx="6108192" cy="4199382"/>
+                      <a:ext cx="6108192" cy="6428764"/>
                     </a:xfrm>
                     <a:prstGeom prst="rect"/>
                   </pic:spPr>
@@ -2746,7 +2701,7 @@
           <w:color w:val="5A6B7B"/>
           <w:sz w:val="17"/>
         </w:rPr>
-        <w:t>Figura 1. Vista de evidencia construida a partir del reporte XML de las 10 pruebas unitarias.</w:t>
+        <w:t>Figura 1. Salida de Maven: 10 pruebas ejecutadas y BUILD SUCCESS.</w:t>
       </w:r>
     </w:p>
     <w:p>
@@ -2758,7 +2713,7 @@
       <w:r>
         <w:drawing>
           <wp:inline xmlns:a="http://schemas.openxmlformats.org/drawingml/2006/main" xmlns:pic="http://schemas.openxmlformats.org/drawingml/2006/picture">
-            <wp:extent cx="6108192" cy="4199382"/>
+            <wp:extent cx="6108192" cy="2036064"/>
             <wp:docPr id="2" name="Picture 2"/>
             <wp:cNvGraphicFramePr>
               <a:graphicFrameLocks noChangeAspect="1"/>
@@ -2767,7 +2722,7 @@
               <a:graphicData uri="http://schemas.openxmlformats.org/drawingml/2006/picture">
                 <pic:pic>
                   <pic:nvPicPr>
-                    <pic:cNvPr id="0" name="02_demostracion_nomina.png"/>
+                    <pic:cNvPr id="0" name="02_ejecucion_demo.png"/>
                     <pic:cNvPicPr/>
                   </pic:nvPicPr>
                   <pic:blipFill>
@@ -2779,7 +2734,7 @@
                   <pic:spPr>
                     <a:xfrm>
                       <a:off x="0" y="0"/>
-                      <a:ext cx="6108192" cy="4199382"/>
+                      <a:ext cx="6108192" cy="2036064"/>
                     </a:xfrm>
                     <a:prstGeom prst="rect"/>
                   </pic:spPr>
@@ -2801,7 +2756,7 @@
           <w:color w:val="5A6B7B"/>
           <w:sz w:val="17"/>
         </w:rPr>
-        <w:t>Figura 2. Vista de los resultados exactos guardados por PayrollDemo; tasas ARL y de comisión ilustrativas.</w:t>
+        <w:t>Figura 2. Salida de la demostración de nómina para cuatro modalidades de empleo.</w:t>
       </w:r>
     </w:p>
     <w:p>
@@ -2809,58 +2764,41 @@
         <w:pStyle w:val="Heading1"/>
       </w:pPr>
       <w:r>
-        <w:t>8. Pendientes de validación y entrega</w:t>
-      </w:r>
-    </w:p>
-    <w:p>
-      <w:pPr>
-        <w:pStyle w:val="ListBullet"/>
-        <w:spacing w:after="60"/>
-      </w:pPr>
-      <w:r>
-        <w:t>Confirmar con el docente o las instrucciones del curso si aceptan la modalidad individual, porque la consigna menciona una exposición por CIPA.</w:t>
-      </w:r>
-    </w:p>
-    <w:p>
-      <w:pPr>
-        <w:pStyle w:val="ListBullet"/>
-        <w:spacing w:after="60"/>
-      </w:pPr>
-      <w:r>
-        <w:t>Acordar con el docente o la empresa la tasa ARL, su base, la tasa de comisión y la interpretación del fondo de ahorro.</w:t>
-      </w:r>
-    </w:p>
-    <w:p>
-      <w:pPr>
-        <w:pStyle w:val="ListBullet"/>
-        <w:spacing w:after="60"/>
-      </w:pPr>
-      <w:r>
-        <w:t>El repositorio actual es personal y no demuestra participación de un CIPA; confirmar si cumple el requisito de control de versiones grupal.</w:t>
-      </w:r>
-    </w:p>
-    <w:p>
-      <w:pPr>
-        <w:pStyle w:val="ListBullet"/>
-        <w:spacing w:after="60"/>
-      </w:pPr>
-      <w:r>
-        <w:t>Preparar y grabar la exposición real que corresponda a la modalidad aceptada, y agregar el enlace auténtico si se mantiene el requisito de YouTube.</w:t>
-      </w:r>
-    </w:p>
-    <w:p>
-      <w:pPr>
-        <w:pStyle w:val="ListBullet"/>
-        <w:spacing w:after="60"/>
-      </w:pPr>
-      <w:r>
-        <w:t>Generar el PDF final revisado y cargarlo en SIMA antes del 1 de noviembre de 2026 a las 23:59, según la captura compartida.</w:t>
+        <w:t>8. Desarrollo individual y enlaces</w:t>
       </w:r>
     </w:p>
     <w:p>
       <w:r>
-        <w:t>No se atribuyen aportes a compañeros ni se afirma que la exposición haya sido grabada. La entrega no se declara completa mientras la modalidad y los requisitos pendientes no se validen.</w:t>
+        <w:t>Realicé esta actividad y el desarrollo del sistema de manera individual. Organicé el trabajo en análisis, diseño orientado a objetos, implementación, pruebas y presentación de resultados.</w:t>
       </w:r>
+    </w:p>
+    <w:p>
+      <w:r>
+        <w:t xml:space="preserve">Video de exposición: </w:t>
+      </w:r>
+      <w:hyperlink r:id="rId13">
+        <w:r>
+          <w:rPr>
+            <w:color w:val="2F75B5"/>
+            <w:u w:val="single"/>
+          </w:rPr>
+          <w:t>https://youtu.be/EykNXmOPGHQ</w:t>
+        </w:r>
+      </w:hyperlink>
+    </w:p>
+    <w:p>
+      <w:r>
+        <w:t xml:space="preserve">Repositorio del proyecto: </w:t>
+      </w:r>
+      <w:hyperlink r:id="rId14">
+        <w:r>
+          <w:rPr>
+            <w:color w:val="2F75B5"/>
+            <w:u w:val="single"/>
+          </w:rPr>
+          <w:t>https://github.com/Nicand16/sistema-nomina-u3-java</w:t>
+        </w:r>
+      </w:hyperlink>
     </w:p>
     <w:p>
       <w:pPr>
@@ -2883,7 +2821,7 @@
     </w:p>
     <w:p>
       <w:r>
-        <w:t>En el segundo comando, sustituya ambas tasas solo por valores acordados. Los parámetros del ejemplo son ilustrativos.</w:t>
+        <w:t>Para los parámetros no definidos en el enunciado adopté supuestos de demostración.</w:t>
       </w:r>
     </w:p>
     <w:p>
@@ -2896,12 +2834,12 @@
     </w:p>
     <w:p>
       <w:r>
-        <w:t>Universidad de Cartagena. (s. f.). Actividad Unidad Tres [consigna en PDF proporcionada para esta tarea, 2 páginas].</w:t>
+        <w:t>Universidad de Cartagena. (s. f.). Actividad Unidad Tres [consigna en PDF proporcionada para esta actividad, 2 páginas].</w:t>
       </w:r>
     </w:p>
     <w:p>
       <w:r>
-        <w:t>JUnit Team. (2025). JUnit 5 User Guide. https://docs.junit.org/5.12.1/user-guide/index.html</w:t>
+        <w:t>JUnit Team. (2024). JUnit 5 User Guide, version 5.11.4. https://docs.junit.org/5.11.4/user-guide/index.html</w:t>
       </w:r>
     </w:p>
     <w:sectPr>

</xml_diff>